<commit_message>
Add Grafana observability portfolio projects
</commit_message>
<xml_diff>
--- a/docs/resume/Agentic_AI_Resume_Integration_Guide.docx
+++ b/docs/resume/Agentic_AI_Resume_Integration_Guide.docx
@@ -140,7 +140,7 @@
           <w:rFonts w:ascii="Calibri" w:hAnsi="Calibri"/>
           <w:sz w:val="22"/>
         </w:rPr>
-        <w:t>Python, FastAPI, Pydantic, TypeScript, React, Next.js, REST APIs, SQL, Docker, GitHub Actions, pytest, Vitest, and OpenTelemetry.</w:t>
+        <w:t>Python, FastAPI, Pydantic, TypeScript, React, Next.js, REST APIs, SQL, Docker, GitHub Actions, pytest, Vitest, Prometheus, PromQL, Grafana, and OpenTelemetry.</w:t>
       </w:r>
     </w:p>
     <w:p>
@@ -235,6 +235,32 @@
           <w:sz w:val="22"/>
         </w:rPr>
         <w:t>Instrumented prototype agent runs with trace IDs, tool usage, latency, retry, and estimated token-cost metrics to support troubleshooting and engineering trade-off discussions.</w:t>
+      </w:r>
+    </w:p>
+    <w:p>
+      <w:pPr>
+        <w:pStyle w:val="PortfolioBullet"/>
+        <w:keepLines/>
+      </w:pPr>
+      <w:r>
+        <w:rPr>
+          <w:rFonts w:ascii="Calibri" w:hAnsi="Calibri"/>
+          <w:sz w:val="22"/>
+        </w:rPr>
+        <w:t>Built Grafana dashboards for workflow SLOs, model cost versus evaluation quality, and tool reliability using bounded Prometheus metrics and version-controlled PromQL queries.</w:t>
+      </w:r>
+    </w:p>
+    <w:p>
+      <w:pPr>
+        <w:pStyle w:val="PortfolioBullet"/>
+        <w:keepLines/>
+      </w:pPr>
+      <w:r>
+        <w:rPr>
+          <w:rFonts w:ascii="Calibri" w:hAnsi="Calibri"/>
+          <w:sz w:val="22"/>
+        </w:rPr>
+        <w:t>Defined prototype alerts for low workflow success, high p95 latency, and elevated tool failure rates, with demonstration thresholds pending production baselines.</w:t>
       </w:r>
     </w:p>
     <w:p>
@@ -350,7 +376,7 @@
           <w:color w:val="5C6573"/>
           <w:sz w:val="21"/>
         </w:rPr>
-        <w:t xml:space="preserve">  |  TypeScript, Next.js, Python, FastAPI, Docker</w:t>
+        <w:t xml:space="preserve">  |  TypeScript, Next.js, Python, FastAPI, Prometheus, Grafana, Docker</w:t>
       </w:r>
     </w:p>
     <w:p>
@@ -390,6 +416,19 @@
           <w:sz w:val="22"/>
         </w:rPr>
         <w:t>Added TypeScript and Python test suites, golden evaluation cases, containerized services, CI quality gates, architecture documentation, and an optional OpenAI Responses API adapter.</w:t>
+      </w:r>
+    </w:p>
+    <w:p>
+      <w:pPr>
+        <w:pStyle w:val="PortfolioBullet"/>
+        <w:keepLines/>
+      </w:pPr>
+      <w:r>
+        <w:rPr>
+          <w:rFonts w:ascii="Calibri" w:hAnsi="Calibri"/>
+          <w:sz w:val="22"/>
+        </w:rPr>
+        <w:t>Added a local Prometheus and Grafana lab with dashboards-as-code, alert provisioning, synthetic traffic, and CI validation for metrics and dashboard configuration.</w:t>
       </w:r>
     </w:p>
     <w:p>
@@ -716,6 +755,100 @@
           <w:sz w:val="22"/>
         </w:rPr>
         <w:t>Turned subjective demo review into a repeatable pass/fail signal and made regressions easier to diagnose from traces and metric breakdowns.</w:t>
+      </w:r>
+    </w:p>
+    <w:p>
+      <w:pPr>
+        <w:pStyle w:val="Heading2"/>
+      </w:pPr>
+      <w:r>
+        <w:t>Agent observability and SLOs</w:t>
+      </w:r>
+    </w:p>
+    <w:p>
+      <w:pPr>
+        <w:spacing w:after="120" w:line="283" w:lineRule="auto"/>
+      </w:pPr>
+      <w:r>
+        <w:rPr>
+          <w:rFonts w:ascii="Calibri" w:hAnsi="Calibri"/>
+          <w:b/>
+          <w:color w:val="1F4D78"/>
+          <w:sz w:val="22"/>
+        </w:rPr>
+        <w:t xml:space="preserve">Situation: </w:t>
+      </w:r>
+      <w:r>
+        <w:rPr>
+          <w:rFonts w:ascii="Calibri" w:hAnsi="Calibri"/>
+          <w:sz w:val="22"/>
+        </w:rPr>
+        <w:t>Agent failures could originate in workflow logic, model behavior, or downstream tools, making a single health check insufficient.</w:t>
+      </w:r>
+    </w:p>
+    <w:p>
+      <w:pPr>
+        <w:spacing w:after="120" w:line="283" w:lineRule="auto"/>
+      </w:pPr>
+      <w:r>
+        <w:rPr>
+          <w:rFonts w:ascii="Calibri" w:hAnsi="Calibri"/>
+          <w:b/>
+          <w:color w:val="1F4D78"/>
+          <w:sz w:val="22"/>
+        </w:rPr>
+        <w:t xml:space="preserve">Task: </w:t>
+      </w:r>
+      <w:r>
+        <w:rPr>
+          <w:rFonts w:ascii="Calibri" w:hAnsi="Calibri"/>
+          <w:sz w:val="22"/>
+        </w:rPr>
+        <w:t>Create operational views that separated user-facing reliability, cost-quality trade-offs, and dependency health.</w:t>
+      </w:r>
+    </w:p>
+    <w:p>
+      <w:pPr>
+        <w:spacing w:after="120" w:line="283" w:lineRule="auto"/>
+      </w:pPr>
+      <w:r>
+        <w:rPr>
+          <w:rFonts w:ascii="Calibri" w:hAnsi="Calibri"/>
+          <w:b/>
+          <w:color w:val="1F4D78"/>
+          <w:sz w:val="22"/>
+        </w:rPr>
+        <w:t xml:space="preserve">Action: </w:t>
+      </w:r>
+      <w:r>
+        <w:rPr>
+          <w:rFonts w:ascii="Calibri" w:hAnsi="Calibri"/>
+          <w:sz w:val="22"/>
+        </w:rPr>
+        <w:t>Instrumented a typed API with bounded Prometheus metrics, wrote PromQL for three provisioned Grafana dashboards, and defined alerts for success rate, p95 latency, and tool errors.</w:t>
+      </w:r>
+    </w:p>
+    <w:p>
+      <w:pPr>
+        <w:spacing w:after="160" w:line="283" w:lineRule="auto" w:before="160"/>
+        <w:shd w:fill="F4F6F9"/>
+        <w:ind w:left="200" w:right="200"/>
+      </w:pPr>
+      <w:r>
+        <w:rPr>
+          <w:rFonts w:ascii="Calibri" w:hAnsi="Calibri"/>
+          <w:b/>
+          <w:color w:val="1F4D78"/>
+          <w:sz w:val="22"/>
+        </w:rPr>
+        <w:t xml:space="preserve">Result: </w:t>
+      </w:r>
+      <w:r>
+        <w:rPr>
+          <w:rFonts w:ascii="Calibri" w:hAnsi="Calibri"/>
+          <w:sz w:val="22"/>
+        </w:rPr>
+        <w:t>Produced a repeatable local observability lab and a concrete baseline for choosing production SLOs and alert thresholds after real traffic became available.</w:t>
       </w:r>
     </w:p>
     <w:p>

</xml_diff>